<commit_message>
docs: remove author metadata and viva questions from project reports
</commit_message>
<xml_diff>
--- a/PROJECT_REPORT.docx
+++ b/PROJECT_REPORT.docx
@@ -90,24 +90,6 @@
                 <w:sz w:val="19"/>
               </w:rPr>
               <w:t>Computer Networks (CN)</w:t>
-              <w:br/>
-            </w:r>
-            <w:r>
-              <w:rPr>
-                <w:rFonts w:ascii="Arial" w:hAnsi="Arial"/>
-                <w:b/>
-                <w:color w:val="334155"/>
-                <w:sz w:val="19"/>
-              </w:rPr>
-              <w:t xml:space="preserve">Author / Candidate: </w:t>
-            </w:r>
-            <w:r>
-              <w:rPr>
-                <w:rFonts w:ascii="Arial" w:hAnsi="Arial"/>
-                <w:color w:val="334155"/>
-                <w:sz w:val="19"/>
-              </w:rPr>
-              <w:t>Suraj Thakur</w:t>
               <w:br/>
             </w:r>
             <w:r>
@@ -4208,162 +4190,7 @@
           <w:color w:val="1E3A8A"/>
           <w:sz w:val="30"/>
         </w:rPr>
-        <w:t>9. Faculty Viva / Oral Examination Q&amp;A Guide</w:t>
-      </w:r>
-    </w:p>
-    <w:p>
-      <w:pPr>
-        <w:keepNext/>
-        <w:spacing w:before="160" w:after="40"/>
-      </w:pPr>
-      <w:r>
-        <w:rPr>
-          <w:rFonts w:ascii="Arial" w:hAnsi="Arial"/>
-          <w:b/>
-          <w:color w:val="1E3A8A"/>
-          <w:sz w:val="21"/>
-        </w:rPr>
-        <w:t>Q1: Why did your team implement a Hybrid architecture using both TCP and UDP instead of relying on one protocol?</w:t>
-      </w:r>
-    </w:p>
-    <w:p>
-      <w:pPr>
-        <w:spacing w:before="40" w:after="120" w:line="283" w:lineRule="auto"/>
-      </w:pPr>
-      <w:r>
-        <w:rPr>
-          <w:rFonts w:ascii="Arial" w:hAnsi="Arial"/>
-          <w:color w:val="334155"/>
-          <w:sz w:val="19"/>
-        </w:rPr>
-        <w:t>Answer: TCP is strictly a connection-oriented, point-to-point protocol requiring a 3-way handshake; it cannot send to broadcast addresses. UDP supports broadcast (255.255.255.255), allowing nodes to discover all peers on the subnet dynamically. However, UDP is unreliable. For text messages and file transfers where packet loss or reordering is intolerable, we switch to reliable, sequenced TCP streams.</w:t>
-      </w:r>
-    </w:p>
-    <w:p>
-      <w:pPr>
-        <w:keepNext/>
-        <w:spacing w:before="160" w:after="40"/>
-      </w:pPr>
-      <w:r>
-        <w:rPr>
-          <w:rFonts w:ascii="Arial" w:hAnsi="Arial"/>
-          <w:b/>
-          <w:color w:val="1E3A8A"/>
-          <w:sz w:val="21"/>
-        </w:rPr>
-        <w:t>Q2: Explain the 'Sticky Packet' problem in TCP socket programming and how you solved it.</w:t>
-      </w:r>
-    </w:p>
-    <w:p>
-      <w:pPr>
-        <w:spacing w:before="40" w:after="120" w:line="283" w:lineRule="auto"/>
-      </w:pPr>
-      <w:r>
-        <w:rPr>
-          <w:rFonts w:ascii="Arial" w:hAnsi="Arial"/>
-          <w:color w:val="334155"/>
-          <w:sz w:val="19"/>
-        </w:rPr>
-        <w:t>Answer: TCP is a byte-stream protocol without inherent message delimiter boundaries. When multiple messages are sent in rapid succession, Nagle's algorithm may aggregate them into a single packet buffer. We solved this in src/network/framing.py by prefixing every transmission with a 4-byte big-endian unsigned integer (struct.pack('!I', length)). The receiver reads exactly 4 bytes, unpacks the length N, and reads until N bytes arrive, guaranteeing perfect message isolation.</w:t>
-      </w:r>
-    </w:p>
-    <w:p>
-      <w:pPr>
-        <w:keepNext/>
-        <w:spacing w:before="160" w:after="40"/>
-      </w:pPr>
-      <w:r>
-        <w:rPr>
-          <w:rFonts w:ascii="Arial" w:hAnsi="Arial"/>
-          <w:b/>
-          <w:color w:val="1E3A8A"/>
-          <w:sz w:val="21"/>
-        </w:rPr>
-        <w:t>Q3: How does your file transfer engine verify that a received file is free of data corruption?</w:t>
-      </w:r>
-    </w:p>
-    <w:p>
-      <w:pPr>
-        <w:spacing w:before="40" w:after="120" w:line="283" w:lineRule="auto"/>
-      </w:pPr>
-      <w:r>
-        <w:rPr>
-          <w:rFonts w:ascii="Arial" w:hAnsi="Arial"/>
-          <w:color w:val="334155"/>
-          <w:sz w:val="19"/>
-        </w:rPr>
-        <w:t>Answer: Before initiating transfer, the sender computes the cryptographic SHA-256 hash digest of the file bytes and transmits it in the FILE_REQUEST header. The receiver writes the received binary chunks to disk and independently calculates the SHA-256 hash. If the hashes match bit-for-bit, the transfer is confirmed; otherwise, it is flagged as corrupted and discarded.</w:t>
-      </w:r>
-    </w:p>
-    <w:p>
-      <w:pPr>
-        <w:keepNext/>
-        <w:spacing w:before="160" w:after="40"/>
-      </w:pPr>
-      <w:r>
-        <w:rPr>
-          <w:rFonts w:ascii="Arial" w:hAnsi="Arial"/>
-          <w:b/>
-          <w:color w:val="1E3A8A"/>
-          <w:sz w:val="21"/>
-        </w:rPr>
-        <w:t>Q4: Why can't network socket calls be placed directly inside Tkinter event handlers?</w:t>
-      </w:r>
-    </w:p>
-    <w:p>
-      <w:pPr>
-        <w:spacing w:before="40" w:after="120" w:line="283" w:lineRule="auto"/>
-      </w:pPr>
-      <w:r>
-        <w:rPr>
-          <w:rFonts w:ascii="Arial" w:hAnsi="Arial"/>
-          <w:color w:val="334155"/>
-          <w:sz w:val="19"/>
-        </w:rPr>
-        <w:t>Answer: Tkinter operates on a single-threaded event loop. Sockets operations such as accept() and recv() are blocking calls. Running them on the main thread freezes the entire graphical interface. We decouple networking into background daemon threads and pass incoming packets to the GUI using Python's thread-safe queue.Queue(), which the main thread polls periodically every 40ms.</w:t>
-      </w:r>
-    </w:p>
-    <w:p>
-      <w:pPr>
-        <w:keepNext/>
-        <w:spacing w:before="160" w:after="40"/>
-      </w:pPr>
-      <w:r>
-        <w:rPr>
-          <w:rFonts w:ascii="Arial" w:hAnsi="Arial"/>
-          <w:b/>
-          <w:color w:val="1E3A8A"/>
-          <w:sz w:val="21"/>
-        </w:rPr>
-        <w:t>Q5: What is Access Point (AP) Isolation and how does your project address it?</w:t>
-      </w:r>
-    </w:p>
-    <w:p>
-      <w:pPr>
-        <w:spacing w:before="40" w:after="120" w:line="283" w:lineRule="auto"/>
-      </w:pPr>
-      <w:r>
-        <w:rPr>
-          <w:rFonts w:ascii="Arial" w:hAnsi="Arial"/>
-          <w:color w:val="334155"/>
-          <w:sz w:val="19"/>
-        </w:rPr>
-        <w:t>Answer: AP Isolation is a security setting on campus and hostel routers that blocks Layer 2/3 traffic between wireless clients on the same subnet. While it prevents direct LAN socket communication over the hostel router, we resolved this by providing two solutions: (1) Mobile Hotspot mode, which bypasses the router and permits direct P2P traffic, and (2) Cloud Web Gateway mode on Render.</w:t>
-      </w:r>
-    </w:p>
-    <w:p>
-      <w:pPr>
-        <w:keepNext/>
-        <w:spacing w:before="360" w:after="120"/>
-      </w:pPr>
-      <w:r>
-        <w:rPr>
-          <w:rFonts w:ascii="Arial" w:hAnsi="Arial"/>
-          <w:b/>
-          <w:color w:val="1E3A8A"/>
-          <w:sz w:val="30"/>
-        </w:rPr>
-        <w:t>10. Conclusion &amp; Future Scope</w:t>
+        <w:t>9. Conclusion &amp; Future Scope</w:t>
       </w:r>
     </w:p>
     <w:p>

</xml_diff>